<commit_message>
fix sisan2, n1, dan semua keterangan tidak muncul
</commit_message>
<xml_diff>
--- a/storage/app/template/temp.docx
+++ b/storage/app/template/temp.docx
@@ -1105,18 +1105,8 @@
                 <w:szCs w:val="18"/>
                 <w:lang w:val="en-US"/>
               </w:rPr>
-              <w:t xml:space="preserve">Mulai </w:t>
-            </w:r>
-            <w:proofErr w:type="spellStart"/>
-            <w:r>
-              <w:rPr>
-                <w:sz w:val="18"/>
-                <w:szCs w:val="18"/>
-                <w:lang w:val="en-US"/>
-              </w:rPr>
-              <w:t>Tanggal</w:t>
-            </w:r>
-            <w:proofErr w:type="spellEnd"/>
+              <w:t>Mulai Tanggal</w:t>
+            </w:r>
           </w:p>
         </w:tc>
         <w:tc>
@@ -1506,7 +1496,7 @@
                 <w:szCs w:val="18"/>
                 <w:lang w:val="en-US"/>
               </w:rPr>
-              <w:t>${SISA_N-2}</w:t>
+              <w:t>${SISA_N2}</w:t>
             </w:r>
           </w:p>
         </w:tc>
@@ -1626,7 +1616,7 @@
                 <w:szCs w:val="18"/>
                 <w:lang w:val="en-US"/>
               </w:rPr>
-              <w:t>${SISA_N-1}</w:t>
+              <w:t>${SISA_N1}</w:t>
             </w:r>
           </w:p>
         </w:tc>
@@ -2253,40 +2243,7 @@
                 <w:szCs w:val="18"/>
                 <w:lang w:val="en-US"/>
               </w:rPr>
-              <w:fldChar w:fldCharType="begin"/>
-            </w:r>
-            <w:r>
-              <w:rPr>
-                <w:sz w:val="18"/>
-                <w:szCs w:val="18"/>
-                <w:lang w:val="en-US"/>
-              </w:rPr>
-              <w:instrText xml:space="preserve"> MERGEFIELD Nama_Bidang </w:instrText>
-            </w:r>
-            <w:r>
-              <w:rPr>
-                <w:sz w:val="18"/>
-                <w:szCs w:val="18"/>
-                <w:lang w:val="en-US"/>
-              </w:rPr>
-              <w:fldChar w:fldCharType="separate"/>
-            </w:r>
-            <w:r>
-              <w:rPr>
-                <w:noProof/>
-                <w:sz w:val="18"/>
-                <w:szCs w:val="18"/>
-                <w:lang w:val="en-US"/>
-              </w:rPr>
-              <w:t>Sekretariat</w:t>
-            </w:r>
-            <w:r>
-              <w:rPr>
-                <w:sz w:val="18"/>
-                <w:szCs w:val="18"/>
-                <w:lang w:val="en-US"/>
-              </w:rPr>
-              <w:fldChar w:fldCharType="end"/>
+              <w:t>${JABATAN_ATASAN}</w:t>
             </w:r>
           </w:p>
           <w:p>
@@ -2347,40 +2304,15 @@
                 <w:szCs w:val="18"/>
                 <w:lang w:val="en-US"/>
               </w:rPr>
-              <w:fldChar w:fldCharType="begin"/>
-            </w:r>
-            <w:r>
-              <w:rPr>
-                <w:sz w:val="18"/>
-                <w:szCs w:val="18"/>
-                <w:lang w:val="en-US"/>
-              </w:rPr>
-              <w:instrText xml:space="preserve"> MERGEFIELD Atasan_Langsung </w:instrText>
-            </w:r>
-            <w:r>
-              <w:rPr>
-                <w:sz w:val="18"/>
-                <w:szCs w:val="18"/>
-                <w:lang w:val="en-US"/>
-              </w:rPr>
-              <w:fldChar w:fldCharType="separate"/>
-            </w:r>
-            <w:r>
-              <w:rPr>
-                <w:noProof/>
-                <w:sz w:val="18"/>
-                <w:szCs w:val="18"/>
-                <w:lang w:val="en-US"/>
-              </w:rPr>
-              <w:t>Budi Riyanto, S.Pd.,M.Pd</w:t>
-            </w:r>
-            <w:r>
-              <w:rPr>
-                <w:sz w:val="18"/>
-                <w:szCs w:val="18"/>
-                <w:lang w:val="en-US"/>
-              </w:rPr>
-              <w:fldChar w:fldCharType="end"/>
+              <w:t xml:space="preserve">       </w:t>
+            </w:r>
+            <w:r>
+              <w:rPr>
+                <w:sz w:val="18"/>
+                <w:szCs w:val="18"/>
+                <w:lang w:val="en-US"/>
+              </w:rPr>
+              <w:t>${NAMA_ATASAN}</w:t>
             </w:r>
           </w:p>
           <w:p>
@@ -2406,40 +2338,7 @@
                 <w:szCs w:val="18"/>
                 <w:lang w:val="en-US"/>
               </w:rPr>
-              <w:fldChar w:fldCharType="begin"/>
-            </w:r>
-            <w:r>
-              <w:rPr>
-                <w:sz w:val="18"/>
-                <w:szCs w:val="18"/>
-                <w:lang w:val="en-US"/>
-              </w:rPr>
-              <w:instrText xml:space="preserve"> MERGEFIELD NIP_Atasan_langsung </w:instrText>
-            </w:r>
-            <w:r>
-              <w:rPr>
-                <w:sz w:val="18"/>
-                <w:szCs w:val="18"/>
-                <w:lang w:val="en-US"/>
-              </w:rPr>
-              <w:fldChar w:fldCharType="separate"/>
-            </w:r>
-            <w:r>
-              <w:rPr>
-                <w:noProof/>
-                <w:sz w:val="18"/>
-                <w:szCs w:val="18"/>
-                <w:lang w:val="en-US"/>
-              </w:rPr>
-              <w:t>19790902 200604 1 005</w:t>
-            </w:r>
-            <w:r>
-              <w:rPr>
-                <w:sz w:val="18"/>
-                <w:szCs w:val="18"/>
-                <w:lang w:val="en-US"/>
-              </w:rPr>
-              <w:fldChar w:fldCharType="end"/>
+              <w:t>${NIP_ATASAN}</w:t>
             </w:r>
           </w:p>
         </w:tc>
@@ -2643,23 +2542,13 @@
                 <w:szCs w:val="18"/>
               </w:rPr>
             </w:pPr>
-            <w:proofErr w:type="spellStart"/>
-            <w:r>
-              <w:rPr>
-                <w:sz w:val="18"/>
-                <w:szCs w:val="18"/>
-                <w:lang w:val="en-US"/>
-              </w:rPr>
-              <w:t>Plt</w:t>
-            </w:r>
-            <w:proofErr w:type="spellEnd"/>
-            <w:r>
-              <w:rPr>
-                <w:sz w:val="18"/>
-                <w:szCs w:val="18"/>
-                <w:lang w:val="en-US"/>
-              </w:rPr>
-              <w:t xml:space="preserve">. </w:t>
+            <w:r>
+              <w:rPr>
+                <w:sz w:val="18"/>
+                <w:szCs w:val="18"/>
+                <w:lang w:val="en-US"/>
+              </w:rPr>
+              <w:t xml:space="preserve">Plt. </w:t>
             </w:r>
             <w:r>
               <w:rPr>
@@ -2746,25 +2635,7 @@
                 <w:szCs w:val="18"/>
                 <w:lang w:val="en-US"/>
               </w:rPr>
-              <w:t xml:space="preserve">M. TAUFIQUR RAHMAN, </w:t>
-            </w:r>
-            <w:proofErr w:type="spellStart"/>
-            <w:r>
-              <w:rPr>
-                <w:sz w:val="18"/>
-                <w:szCs w:val="18"/>
-                <w:lang w:val="en-US"/>
-              </w:rPr>
-              <w:t>S.Ag</w:t>
-            </w:r>
-            <w:proofErr w:type="spellEnd"/>
-            <w:r>
-              <w:rPr>
-                <w:sz w:val="18"/>
-                <w:szCs w:val="18"/>
-                <w:lang w:val="en-US"/>
-              </w:rPr>
-              <w:t>., M.S.I</w:t>
+              <w:t>M. TAUFIQUR RAHMAN, S.Ag., M.S.I</w:t>
             </w:r>
           </w:p>
           <w:p>

</xml_diff>

<commit_message>
Ubah agar user bisa mengajukan cuti sebelum hari ini dan merapikan template surat cuti
</commit_message>
<xml_diff>
--- a/storage/app/template/temp.docx
+++ b/storage/app/template/temp.docx
@@ -1105,8 +1105,18 @@
                 <w:szCs w:val="18"/>
                 <w:lang w:val="en-US"/>
               </w:rPr>
-              <w:t>Mulai Tanggal</w:t>
-            </w:r>
+              <w:t xml:space="preserve">Mulai </w:t>
+            </w:r>
+            <w:proofErr w:type="spellStart"/>
+            <w:r>
+              <w:rPr>
+                <w:sz w:val="18"/>
+                <w:szCs w:val="18"/>
+                <w:lang w:val="en-US"/>
+              </w:rPr>
+              <w:t>Tanggal</w:t>
+            </w:r>
+            <w:proofErr w:type="spellEnd"/>
           </w:p>
         </w:tc>
         <w:tc>
@@ -1201,16 +1211,17 @@
       </w:tblPr>
       <w:tblGrid>
         <w:gridCol w:w="725"/>
-        <w:gridCol w:w="1021"/>
+        <w:gridCol w:w="1227"/>
         <w:gridCol w:w="1651"/>
         <w:gridCol w:w="2552"/>
         <w:gridCol w:w="3827"/>
+        <w:gridCol w:w="8"/>
       </w:tblGrid>
       <w:tr>
         <w:tc>
           <w:tcPr>
-            <w:tcW w:w="9776" w:type="dxa"/>
-            <w:gridSpan w:val="5"/>
+            <w:tcW w:w="9990" w:type="dxa"/>
+            <w:gridSpan w:val="6"/>
           </w:tcPr>
           <w:p>
             <w:pPr>
@@ -1236,10 +1247,14 @@
         </w:tc>
       </w:tr>
       <w:tr>
-        <w:tc>
-          <w:tcPr>
-            <w:tcW w:w="1746" w:type="dxa"/>
-            <w:gridSpan w:val="2"/>
+        <w:trPr>
+          <w:gridAfter w:val="1"/>
+          <w:wAfter w:w="8" w:type="dxa"/>
+        </w:trPr>
+        <w:tc>
+          <w:tcPr>
+            <w:tcW w:w="3603" w:type="dxa"/>
+            <w:gridSpan w:val="3"/>
           </w:tcPr>
           <w:p>
             <w:pPr>
@@ -1248,7 +1263,6 @@
                 <w:ilvl w:val="0"/>
                 <w:numId w:val="3"/>
               </w:numPr>
-              <w:ind w:left="423" w:hanging="423"/>
               <w:rPr>
                 <w:sz w:val="18"/>
                 <w:szCs w:val="18"/>
@@ -1260,28 +1274,6 @@
                 <w:szCs w:val="18"/>
               </w:rPr>
               <w:t xml:space="preserve">CUTI TAHUNAN  </w:t>
-            </w:r>
-          </w:p>
-        </w:tc>
-        <w:tc>
-          <w:tcPr>
-            <w:tcW w:w="1651" w:type="dxa"/>
-          </w:tcPr>
-          <w:p>
-            <w:pPr>
-              <w:pStyle w:val="NoSpacing"/>
-              <w:jc w:val="center"/>
-              <w:rPr>
-                <w:sz w:val="18"/>
-                <w:szCs w:val="18"/>
-              </w:rPr>
-            </w:pPr>
-            <w:r>
-              <w:rPr>
-                <w:sz w:val="18"/>
-                <w:szCs w:val="18"/>
-              </w:rPr>
-              <w:t>${CUTI_TAHUNAN}</w:t>
             </w:r>
           </w:p>
         </w:tc>
@@ -1337,6 +1329,10 @@
         </w:tc>
       </w:tr>
       <w:tr>
+        <w:trPr>
+          <w:gridAfter w:val="1"/>
+          <w:wAfter w:w="8" w:type="dxa"/>
+        </w:trPr>
         <w:tc>
           <w:tcPr>
             <w:tcW w:w="725" w:type="dxa"/>
@@ -1360,7 +1356,7 @@
         </w:tc>
         <w:tc>
           <w:tcPr>
-            <w:tcW w:w="1021" w:type="dxa"/>
+            <w:tcW w:w="1227" w:type="dxa"/>
           </w:tcPr>
           <w:p>
             <w:pPr>
@@ -1455,6 +1451,10 @@
         </w:tc>
       </w:tr>
       <w:tr>
+        <w:trPr>
+          <w:gridAfter w:val="1"/>
+          <w:wAfter w:w="8" w:type="dxa"/>
+        </w:trPr>
         <w:tc>
           <w:tcPr>
             <w:tcW w:w="725" w:type="dxa"/>
@@ -1478,7 +1478,7 @@
         </w:tc>
         <w:tc>
           <w:tcPr>
-            <w:tcW w:w="1021" w:type="dxa"/>
+            <w:tcW w:w="1227" w:type="dxa"/>
           </w:tcPr>
           <w:p>
             <w:pPr>
@@ -1575,6 +1575,10 @@
         </w:tc>
       </w:tr>
       <w:tr>
+        <w:trPr>
+          <w:gridAfter w:val="1"/>
+          <w:wAfter w:w="8" w:type="dxa"/>
+        </w:trPr>
         <w:tc>
           <w:tcPr>
             <w:tcW w:w="725" w:type="dxa"/>
@@ -1598,7 +1602,7 @@
         </w:tc>
         <w:tc>
           <w:tcPr>
-            <w:tcW w:w="1021" w:type="dxa"/>
+            <w:tcW w:w="1227" w:type="dxa"/>
           </w:tcPr>
           <w:p>
             <w:pPr>
@@ -1694,6 +1698,10 @@
         </w:tc>
       </w:tr>
       <w:tr>
+        <w:trPr>
+          <w:gridAfter w:val="1"/>
+          <w:wAfter w:w="8" w:type="dxa"/>
+        </w:trPr>
         <w:tc>
           <w:tcPr>
             <w:tcW w:w="725" w:type="dxa"/>
@@ -1717,7 +1725,7 @@
         </w:tc>
         <w:tc>
           <w:tcPr>
-            <w:tcW w:w="1021" w:type="dxa"/>
+            <w:tcW w:w="1227" w:type="dxa"/>
           </w:tcPr>
           <w:p>
             <w:pPr>
@@ -2542,13 +2550,23 @@
                 <w:szCs w:val="18"/>
               </w:rPr>
             </w:pPr>
-            <w:r>
-              <w:rPr>
-                <w:sz w:val="18"/>
-                <w:szCs w:val="18"/>
-                <w:lang w:val="en-US"/>
-              </w:rPr>
-              <w:t xml:space="preserve">Plt. </w:t>
+            <w:proofErr w:type="spellStart"/>
+            <w:r>
+              <w:rPr>
+                <w:sz w:val="18"/>
+                <w:szCs w:val="18"/>
+                <w:lang w:val="en-US"/>
+              </w:rPr>
+              <w:t>Plt</w:t>
+            </w:r>
+            <w:proofErr w:type="spellEnd"/>
+            <w:r>
+              <w:rPr>
+                <w:sz w:val="18"/>
+                <w:szCs w:val="18"/>
+                <w:lang w:val="en-US"/>
+              </w:rPr>
+              <w:t xml:space="preserve">. </w:t>
             </w:r>
             <w:r>
               <w:rPr>
@@ -2635,7 +2653,25 @@
                 <w:szCs w:val="18"/>
                 <w:lang w:val="en-US"/>
               </w:rPr>
-              <w:t>M. TAUFIQUR RAHMAN, S.Ag., M.S.I</w:t>
+              <w:t xml:space="preserve">M. TAUFIQUR RAHMAN, </w:t>
+            </w:r>
+            <w:proofErr w:type="spellStart"/>
+            <w:r>
+              <w:rPr>
+                <w:sz w:val="18"/>
+                <w:szCs w:val="18"/>
+                <w:lang w:val="en-US"/>
+              </w:rPr>
+              <w:t>S.Ag</w:t>
+            </w:r>
+            <w:proofErr w:type="spellEnd"/>
+            <w:r>
+              <w:rPr>
+                <w:sz w:val="18"/>
+                <w:szCs w:val="18"/>
+                <w:lang w:val="en-US"/>
+              </w:rPr>
+              <w:t>., M.S.I</w:t>
             </w:r>
           </w:p>
           <w:p>

</xml_diff>